<commit_message>
update assignments 01-03: replace overlapping questions, reformat notebooks
- Assignment 02 bonus: replace "Tokenisation Cost Analysis" with
  "Can Machines Think?" (Turing, philosophy of intelligence)
- Assignment 03 Q1: replace "Token Cost Disparity" with "Why the
  Best AI Might Not Be Best for You" (Goodhart's Law, benchmarks)
- Regenerate all ipynb files to match assignment 07 cell format
- Re-render all docx files from updated qmd sources
</commit_message>
<xml_diff>
--- a/assignments/02-assignment.docx
+++ b/assignments/02-assignment.docx
@@ -26,7 +26,7 @@
         <w:t xml:space="preserve">Emory University</w:t>
       </w:r>
     </w:p>
-    <w:bookmarkStart w:id="29" w:name="instructions"/>
+    <w:bookmarkStart w:id="28" w:name="instructions"/>
     <w:p>
       <w:pPr>
         <w:pStyle w:val="Heading2"/>
@@ -1360,13 +1360,13 @@
       </w:r>
     </w:p>
     <w:bookmarkEnd w:id="26"/>
-    <w:bookmarkStart w:id="28" w:name="X4f8ea98090cef0c6143151e82d770811f98c22d"/>
+    <w:bookmarkStart w:id="27" w:name="bonus-question-can-machines-think"/>
     <w:p>
       <w:pPr>
         <w:pStyle w:val="Heading3"/>
       </w:pPr>
       <w:r>
-        <w:t xml:space="preserve">Bonus Question: Tokenisation Cost Analysis</w:t>
+        <w:t xml:space="preserve">Bonus Question: Can Machines Think?</w:t>
       </w:r>
     </w:p>
     <w:p>
@@ -1374,131 +1374,140 @@
         <w:pStyle w:val="FirstParagraph"/>
       </w:pPr>
       <w:r>
-        <w:t xml:space="preserve">Visit</w:t>
-      </w:r>
-      <w:r>
-        <w:t xml:space="preserve"> </w:t>
-      </w:r>
-      <w:hyperlink r:id="rId27">
-        <w:r>
-          <w:rPr>
-            <w:rStyle w:val="Hyperlink"/>
-          </w:rPr>
-          <w:t xml:space="preserve">OpenAI’s Tokenizer</w:t>
-        </w:r>
-      </w:hyperlink>
-      <w:r>
-        <w:t xml:space="preserve"> </w:t>
-      </w:r>
-      <w:r>
-        <w:t xml:space="preserve">and explore how different texts are tokenised.</w:t>
-      </w:r>
-    </w:p>
-    <w:p>
-      <w:pPr>
-        <w:pStyle w:val="Compact"/>
+        <w:t xml:space="preserve">In 1950, Alan Turing published</w:t>
+      </w:r>
+      <w:r>
+        <w:t xml:space="preserve"> </w:t>
+      </w:r>
+      <w:r>
+        <w:t xml:space="preserve">“Computing Machinery and Intelligence,”</w:t>
+      </w:r>
+      <w:r>
+        <w:t xml:space="preserve"> </w:t>
+      </w:r>
+      <w:r>
+        <w:t xml:space="preserve">where he proposed replacing the question</w:t>
+      </w:r>
+      <w:r>
+        <w:t xml:space="preserve"> </w:t>
+      </w:r>
+      <w:r>
+        <w:t xml:space="preserve">“Can machines think?”</w:t>
+      </w:r>
+      <w:r>
+        <w:t xml:space="preserve"> </w:t>
+      </w:r>
+      <w:r>
+        <w:t xml:space="preserve">with a practical test: can a machine fool a human into believing it is human? Turing argued that if a machine behaves indistinguishably from a thinking being, we have no good reason to deny it thinks.</w:t>
+      </w:r>
+    </w:p>
+    <w:p>
+      <w:pPr>
+        <w:pStyle w:val="BodyText"/>
+      </w:pPr>
+      <w:r>
+        <w:t xml:space="preserve">But not everyone agrees. Some philosophers argue there is a difference between</w:t>
+      </w:r>
+      <w:r>
+        <w:t xml:space="preserve"> </w:t>
+      </w:r>
+      <w:r>
+        <w:rPr>
+          <w:i/>
+          <w:iCs/>
+        </w:rPr>
+        <w:t xml:space="preserve">simulating</w:t>
+      </w:r>
+      <w:r>
+        <w:t xml:space="preserve"> </w:t>
+      </w:r>
+      <w:r>
+        <w:t xml:space="preserve">intelligence and</w:t>
+      </w:r>
+      <w:r>
+        <w:t xml:space="preserve"> </w:t>
+      </w:r>
+      <w:r>
+        <w:rPr>
+          <w:i/>
+          <w:iCs/>
+        </w:rPr>
+        <w:t xml:space="preserve">having</w:t>
+      </w:r>
+      <w:r>
+        <w:t xml:space="preserve"> </w:t>
+      </w:r>
+      <w:r>
+        <w:t xml:space="preserve">intelligence. A calculator can multiply faster than any human, but we don’t say it</w:t>
+      </w:r>
+      <w:r>
+        <w:t xml:space="preserve"> </w:t>
+      </w:r>
+      <w:r>
+        <w:t xml:space="preserve">“understands”</w:t>
+      </w:r>
+      <w:r>
+        <w:t xml:space="preserve"> </w:t>
+      </w:r>
+      <w:r>
+        <w:t xml:space="preserve">multiplication. A chatbot can write a poem, but does it</w:t>
+      </w:r>
+      <w:r>
+        <w:t xml:space="preserve"> </w:t>
+      </w:r>
+      <w:r>
+        <w:t xml:space="preserve">“understand”</w:t>
+      </w:r>
+      <w:r>
+        <w:t xml:space="preserve"> </w:t>
+      </w:r>
+      <w:r>
+        <w:t xml:space="preserve">poetry?</w:t>
+      </w:r>
+    </w:p>
+    <w:p>
+      <w:pPr>
+        <w:pStyle w:val="BodyText"/>
+      </w:pPr>
+      <w:r>
+        <w:rPr>
+          <w:b/>
+          <w:bCs/>
+        </w:rPr>
+        <w:t xml:space="preserve">Your task:</w:t>
+      </w:r>
+    </w:p>
+    <w:p>
+      <w:pPr>
         <w:numPr>
           <w:ilvl w:val="0"/>
           <w:numId w:val="1012"/>
         </w:numPr>
       </w:pPr>
       <w:r>
-        <w:t xml:space="preserve">Tokenise your full name. How many tokens is it?</w:t>
-      </w:r>
-    </w:p>
-    <w:p>
-      <w:pPr>
-        <w:pStyle w:val="Compact"/>
+        <w:t xml:space="preserve">Have a short conversation (at least 5 exchanges) with ChatGPT, Claude, or another LLM about a topic you care about. Pay attention to whether the responses feel like genuine understanding or sophisticated pattern matching.</w:t>
+      </w:r>
+    </w:p>
+    <w:p>
+      <w:pPr>
         <w:numPr>
           <w:ilvl w:val="0"/>
           <w:numId w:val="1012"/>
         </w:numPr>
       </w:pPr>
       <w:r>
-        <w:t xml:space="preserve">Tokenise</w:t>
-      </w:r>
-      <w:r>
-        <w:t xml:space="preserve"> </w:t>
-      </w:r>
-      <w:r>
-        <w:t xml:space="preserve">“artificial intelligence”</w:t>
-      </w:r>
-      <w:r>
-        <w:t xml:space="preserve"> </w:t>
-      </w:r>
-      <w:r>
-        <w:t xml:space="preserve">vs. </w:t>
-      </w:r>
-      <w:r>
-        <w:t xml:space="preserve">“AI”</w:t>
-      </w:r>
-      <w:r>
-        <w:t xml:space="preserve">. What’s the difference?</w:t>
-      </w:r>
-    </w:p>
-    <w:p>
-      <w:pPr>
-        <w:pStyle w:val="Compact"/>
+        <w:t xml:space="preserve">Take a position: is there a meaningful difference between simulating intelligence and having intelligence? Or is the distinction meaningless, since we can only ever judge intelligence by outward behaviour? Defend your view.</w:t>
+      </w:r>
+    </w:p>
+    <w:p>
+      <w:pPr>
         <w:numPr>
           <w:ilvl w:val="0"/>
           <w:numId w:val="1012"/>
         </w:numPr>
       </w:pPr>
       <w:r>
-        <w:t xml:space="preserve">Tokenise</w:t>
-      </w:r>
-      <w:r>
-        <w:t xml:space="preserve"> </w:t>
-      </w:r>
-      <w:r>
-        <w:t xml:space="preserve">“Hello”</w:t>
-      </w:r>
-      <w:r>
-        <w:t xml:space="preserve"> </w:t>
-      </w:r>
-      <w:r>
-        <w:t xml:space="preserve">(English) vs. </w:t>
-      </w:r>
-      <w:r>
-        <w:rPr>
-          <w:rFonts w:hint="eastAsia"/>
-        </w:rPr>
-        <w:t xml:space="preserve">“你好”</w:t>
-      </w:r>
-      <w:r>
-        <w:t xml:space="preserve"> </w:t>
-      </w:r>
-      <w:r>
-        <w:t xml:space="preserve">(Chinese for</w:t>
-      </w:r>
-      <w:r>
-        <w:t xml:space="preserve"> </w:t>
-      </w:r>
-      <w:r>
-        <w:t xml:space="preserve">“Hello”</w:t>
-      </w:r>
-      <w:r>
-        <w:t xml:space="preserve">). What do you notice?</w:t>
-      </w:r>
-    </w:p>
-    <w:p>
-      <w:pPr>
-        <w:pStyle w:val="Compact"/>
-        <w:numPr>
-          <w:ilvl w:val="0"/>
-          <w:numId w:val="1012"/>
-        </w:numPr>
-      </w:pPr>
-      <w:r>
-        <w:t xml:space="preserve">If GPT-4 costs $0.03 per 1,000 input tokens, estimate the cost of a 500-word essay prompt.</w:t>
-      </w:r>
-    </w:p>
-    <w:p>
-      <w:pPr>
-        <w:pStyle w:val="FirstParagraph"/>
-      </w:pPr>
-      <w:r>
-        <w:t xml:space="preserve">Based on your experiments, why might non-English speakers face higher costs when using LLMs? Is this fair?</w:t>
+        <w:t xml:space="preserve">Consider this thought experiment: if a future AI passes every test of intelligence we can design, responds emotionally, asks its own questions, and claims to be conscious, would you believe it? Why or why not?</w:t>
       </w:r>
     </w:p>
     <w:p>
@@ -1544,8 +1553,8 @@
         <w:br/>
       </w:r>
     </w:p>
+    <w:bookmarkEnd w:id="27"/>
     <w:bookmarkEnd w:id="28"/>
-    <w:bookmarkEnd w:id="29"/>
     <w:sectPr>
       <w:footnotePr>
         <w:numRestart w:val="eachSect"/>

</xml_diff>

<commit_message>
fix(assignments): align 08-10 dates with datasci350, re-anchor questions to taught lectures
</commit_message>
<xml_diff>
--- a/assignments/02-assignment.docx
+++ b/assignments/02-assignment.docx
@@ -26,7 +26,7 @@
         <w:t xml:space="preserve">Emory University</w:t>
       </w:r>
     </w:p>
-    <w:bookmarkStart w:id="17" w:name="instructions"/>
+    <w:bookmarkStart w:id="18" w:name="instructions"/>
     <w:p>
       <w:pPr>
         <w:pStyle w:val="Heading2"/>
@@ -1076,7 +1076,7 @@
           <w:i/>
           <w:iCs/>
         </w:rPr>
-        <w:t xml:space="preserve">“What is Amazon Mechanical Turk, and why is it controversial for data labelling?”</w:t>
+        <w:t xml:space="preserve">“Why do different people often give the same example different labels, and how do annotation guidelines help?”</w:t>
       </w:r>
     </w:p>
     <w:p>
@@ -1178,13 +1178,13 @@
       </w:r>
     </w:p>
     <w:bookmarkEnd w:id="14"/>
-    <w:bookmarkStart w:id="15" w:name="question-5-ai-ethics-panel"/>
+    <w:bookmarkStart w:id="16" w:name="question-5-seeing-like-a-tokeniser"/>
     <w:p>
       <w:pPr>
         <w:pStyle w:val="Heading3"/>
       </w:pPr>
       <w:r>
-        <w:t xml:space="preserve">Question 5: AI Ethics Panel</w:t>
+        <w:t xml:space="preserve">Question 5: Seeing Like a Tokeniser</w:t>
       </w:r>
     </w:p>
     <w:p>
@@ -1192,7 +1192,54 @@
         <w:pStyle w:val="FirstParagraph"/>
       </w:pPr>
       <w:r>
-        <w:t xml:space="preserve">Imagine you’re on a panel debating the following question:</w:t>
+        <w:t xml:space="preserve">Before an LLM can process your words, it splits them into tokens and turns each token into an embedding (Lecture 06).</w:t>
+      </w:r>
+    </w:p>
+    <w:p>
+      <w:pPr>
+        <w:pStyle w:val="BodyText"/>
+      </w:pPr>
+      <w:r>
+        <w:rPr>
+          <w:b/>
+          <w:bCs/>
+        </w:rPr>
+        <w:t xml:space="preserve">Your task:</w:t>
+      </w:r>
+    </w:p>
+    <w:p>
+      <w:pPr>
+        <w:pStyle w:val="Compact"/>
+        <w:numPr>
+          <w:ilvl w:val="0"/>
+          <w:numId w:val="1011"/>
+        </w:numPr>
+      </w:pPr>
+      <w:r>
+        <w:t xml:space="preserve">Visit OpenAI’s tokeniser at</w:t>
+      </w:r>
+      <w:r>
+        <w:t xml:space="preserve"> </w:t>
+      </w:r>
+      <w:hyperlink r:id="rId15">
+        <w:r>
+          <w:rPr>
+            <w:rStyle w:val="Hyperlink"/>
+          </w:rPr>
+          <w:t xml:space="preserve">platform.openai.com/tokenizer</w:t>
+        </w:r>
+      </w:hyperlink>
+    </w:p>
+    <w:p>
+      <w:pPr>
+        <w:pStyle w:val="Compact"/>
+        <w:numPr>
+          <w:ilvl w:val="0"/>
+          <w:numId w:val="1011"/>
+        </w:numPr>
+      </w:pPr>
+      <w:r>
+        <w:t xml:space="preserve">Paste this sentence:</w:t>
       </w:r>
       <w:r>
         <w:t xml:space="preserve"> </w:t>
@@ -1202,111 +1249,149 @@
           <w:i/>
           <w:iCs/>
         </w:rPr>
-        <w:t xml:space="preserve">“Should AI-generated images and voices require mandatory watermarks or disclosure labels?”</w:t>
-      </w:r>
-    </w:p>
-    <w:p>
-      <w:pPr>
-        <w:pStyle w:val="BodyText"/>
+        <w:t xml:space="preserve">“The quick brown fox jumps over the lazy dog”</w:t>
+      </w:r>
+      <w:r>
+        <w:t xml:space="preserve"> </w:t>
+      </w:r>
+      <w:r>
+        <w:t xml:space="preserve">and record the token count</w:t>
+      </w:r>
+    </w:p>
+    <w:p>
+      <w:pPr>
+        <w:pStyle w:val="Compact"/>
+        <w:numPr>
+          <w:ilvl w:val="0"/>
+          <w:numId w:val="1011"/>
+        </w:numPr>
+      </w:pPr>
+      <w:r>
+        <w:t xml:space="preserve">Paste the Spanish translation:</w:t>
+      </w:r>
+      <w:r>
+        <w:t xml:space="preserve"> </w:t>
+      </w:r>
+      <w:r>
+        <w:rPr>
+          <w:i/>
+          <w:iCs/>
+        </w:rPr>
+        <w:t xml:space="preserve">“El rápido zorro marrón salta sobre el perro perezoso”</w:t>
+      </w:r>
+      <w:r>
+        <w:t xml:space="preserve"> </w:t>
+      </w:r>
+      <w:r>
+        <w:t xml:space="preserve">and record the token count</w:t>
+      </w:r>
+    </w:p>
+    <w:p>
+      <w:pPr>
+        <w:pStyle w:val="Compact"/>
+        <w:numPr>
+          <w:ilvl w:val="0"/>
+          <w:numId w:val="1011"/>
+        </w:numPr>
+      </w:pPr>
+      <w:r>
+        <w:t xml:space="preserve">Paste the words</w:t>
+      </w:r>
+      <w:r>
+        <w:t xml:space="preserve"> </w:t>
+      </w:r>
+      <w:r>
+        <w:rPr>
+          <w:i/>
+          <w:iCs/>
+        </w:rPr>
+        <w:t xml:space="preserve">“unbelievable”</w:t>
+      </w:r>
+      <w:r>
+        <w:t xml:space="preserve"> </w:t>
+      </w:r>
+      <w:r>
+        <w:t xml:space="preserve">and</w:t>
+      </w:r>
+      <w:r>
+        <w:t xml:space="preserve"> </w:t>
+      </w:r>
+      <w:r>
+        <w:rPr>
+          <w:i/>
+          <w:iCs/>
+        </w:rPr>
+        <w:t xml:space="preserve">“unbelievableness”</w:t>
+      </w:r>
+      <w:r>
+        <w:t xml:space="preserve"> </w:t>
+      </w:r>
+      <w:r>
+        <w:t xml:space="preserve">and note how each one is split</w:t>
+      </w:r>
+    </w:p>
+    <w:p>
+      <w:pPr>
+        <w:pStyle w:val="FirstParagraph"/>
       </w:pPr>
       <w:r>
         <w:rPr>
           <w:b/>
           <w:bCs/>
         </w:rPr>
-        <w:t xml:space="preserve">Part 1:</w:t>
-      </w:r>
-      <w:r>
-        <w:t xml:space="preserve"> </w:t>
-      </w:r>
-      <w:r>
-        <w:t xml:space="preserve">Ask an LLM for arguments</w:t>
-      </w:r>
-      <w:r>
-        <w:t xml:space="preserve"> </w:t>
-      </w:r>
-      <w:r>
-        <w:rPr>
-          <w:b/>
-          <w:bCs/>
-        </w:rPr>
-        <w:t xml:space="preserve">both FOR and AGAINST</w:t>
-      </w:r>
-      <w:r>
-        <w:t xml:space="preserve"> </w:t>
-      </w:r>
-      <w:r>
-        <w:t xml:space="preserve">this policy. Document the main points it provides.</w:t>
-      </w:r>
-    </w:p>
-    <w:p>
-      <w:pPr>
-        <w:pStyle w:val="BodyText"/>
-      </w:pPr>
-      <w:r>
-        <w:rPr>
-          <w:b/>
-          <w:bCs/>
-        </w:rPr>
-        <w:t xml:space="preserve">Part 2:</w:t>
-      </w:r>
-      <w:r>
-        <w:t xml:space="preserve"> </w:t>
-      </w:r>
-      <w:r>
-        <w:t xml:space="preserve">Write your own position on this issue. Your position should include:</w:t>
-      </w:r>
-    </w:p>
-    <w:p>
-      <w:pPr>
-        <w:pStyle w:val="Compact"/>
-        <w:numPr>
-          <w:ilvl w:val="0"/>
-          <w:numId w:val="1011"/>
-        </w:numPr>
-      </w:pPr>
-      <w:r>
-        <w:t xml:space="preserve">Your stance (for, against, or somewhere in between)</w:t>
-      </w:r>
-    </w:p>
-    <w:p>
-      <w:pPr>
-        <w:pStyle w:val="Compact"/>
-        <w:numPr>
-          <w:ilvl w:val="0"/>
-          <w:numId w:val="1011"/>
-        </w:numPr>
-      </w:pPr>
-      <w:r>
-        <w:t xml:space="preserve">At least</w:t>
-      </w:r>
-      <w:r>
-        <w:t xml:space="preserve"> </w:t>
-      </w:r>
-      <w:r>
-        <w:rPr>
-          <w:b/>
-          <w:bCs/>
-        </w:rPr>
-        <w:t xml:space="preserve">one original argument</w:t>
-      </w:r>
-      <w:r>
-        <w:t xml:space="preserve"> </w:t>
-      </w:r>
-      <w:r>
-        <w:t xml:space="preserve">that the LLM did not provide</w:t>
-      </w:r>
-    </w:p>
-    <w:p>
-      <w:pPr>
-        <w:pStyle w:val="Compact"/>
-        <w:numPr>
-          <w:ilvl w:val="0"/>
-          <w:numId w:val="1011"/>
-        </w:numPr>
-      </w:pPr>
-      <w:r>
-        <w:t xml:space="preserve">Consideration of some group that might be affected by this policy (creators, consumers, artists, journalists, etc.)</w:t>
+        <w:t xml:space="preserve">Analysis:</w:t>
+      </w:r>
+    </w:p>
+    <w:p>
+      <w:pPr>
+        <w:pStyle w:val="Compact"/>
+        <w:numPr>
+          <w:ilvl w:val="0"/>
+          <w:numId w:val="1012"/>
+        </w:numPr>
+      </w:pPr>
+      <w:r>
+        <w:t xml:space="preserve">Does the Spanish sentence need more tokens than the English one? Record what you find</w:t>
+      </w:r>
+    </w:p>
+    <w:p>
+      <w:pPr>
+        <w:pStyle w:val="Compact"/>
+        <w:numPr>
+          <w:ilvl w:val="0"/>
+          <w:numId w:val="1012"/>
+        </w:numPr>
+      </w:pPr>
+      <w:r>
+        <w:t xml:space="preserve">Ask an LLM:</w:t>
+      </w:r>
+      <w:r>
+        <w:t xml:space="preserve"> </w:t>
+      </w:r>
+      <w:r>
+        <w:rPr>
+          <w:i/>
+          <w:iCs/>
+        </w:rPr>
+        <w:t xml:space="preserve">“Why do LLMs often perform better in English than in other languages?”</w:t>
+      </w:r>
+      <w:r>
+        <w:t xml:space="preserve"> </w:t>
+      </w:r>
+      <w:r>
+        <w:t xml:space="preserve">Compare its answer with what you observed</w:t>
+      </w:r>
+    </w:p>
+    <w:p>
+      <w:pPr>
+        <w:pStyle w:val="Compact"/>
+        <w:numPr>
+          <w:ilvl w:val="0"/>
+          <w:numId w:val="1012"/>
+        </w:numPr>
+      </w:pPr>
+      <w:r>
+        <w:t xml:space="preserve">In your own words, explain what an embedding captures that a token ID alone does not</w:t>
       </w:r>
     </w:p>
     <w:p>
@@ -1359,8 +1444,8 @@
         </w:pict>
       </w:r>
     </w:p>
-    <w:bookmarkEnd w:id="15"/>
-    <w:bookmarkStart w:id="16" w:name="bonus-question-can-machines-think"/>
+    <w:bookmarkEnd w:id="16"/>
+    <w:bookmarkStart w:id="17" w:name="bonus-question-can-machines-think"/>
     <w:p>
       <w:pPr>
         <w:pStyle w:val="Heading3"/>
@@ -1481,7 +1566,7 @@
       <w:pPr>
         <w:numPr>
           <w:ilvl w:val="0"/>
-          <w:numId w:val="1012"/>
+          <w:numId w:val="1013"/>
         </w:numPr>
       </w:pPr>
       <w:r>
@@ -1492,7 +1577,7 @@
       <w:pPr>
         <w:numPr>
           <w:ilvl w:val="0"/>
-          <w:numId w:val="1012"/>
+          <w:numId w:val="1013"/>
         </w:numPr>
       </w:pPr>
       <w:r>
@@ -1503,7 +1588,7 @@
       <w:pPr>
         <w:numPr>
           <w:ilvl w:val="0"/>
-          <w:numId w:val="1012"/>
+          <w:numId w:val="1013"/>
         </w:numPr>
       </w:pPr>
       <w:r>
@@ -1553,8 +1638,8 @@
         <w:br/>
       </w:r>
     </w:p>
-    <w:bookmarkEnd w:id="16"/>
     <w:bookmarkEnd w:id="17"/>
+    <w:bookmarkEnd w:id="18"/>
     <w:sectPr>
       <w:footnotePr>
         <w:numRestart w:val="eachSect"/>
@@ -2022,9 +2107,39 @@
     <w:abstractNumId w:val="991"/>
   </w:num>
   <w:num w:numId="1011">
+    <w:abstractNumId w:val="99411"/>
+    <w:lvlOverride w:ilvl="0">
+      <w:startOverride w:val="1"/>
+    </w:lvlOverride>
+    <w:lvlOverride w:ilvl="1">
+      <w:startOverride w:val="1"/>
+    </w:lvlOverride>
+    <w:lvlOverride w:ilvl="2">
+      <w:startOverride w:val="1"/>
+    </w:lvlOverride>
+    <w:lvlOverride w:ilvl="3">
+      <w:startOverride w:val="1"/>
+    </w:lvlOverride>
+    <w:lvlOverride w:ilvl="4">
+      <w:startOverride w:val="1"/>
+    </w:lvlOverride>
+    <w:lvlOverride w:ilvl="5">
+      <w:startOverride w:val="1"/>
+    </w:lvlOverride>
+    <w:lvlOverride w:ilvl="6">
+      <w:startOverride w:val="1"/>
+    </w:lvlOverride>
+    <w:lvlOverride w:ilvl="7">
+      <w:startOverride w:val="1"/>
+    </w:lvlOverride>
+    <w:lvlOverride w:ilvl="8">
+      <w:startOverride w:val="1"/>
+    </w:lvlOverride>
+  </w:num>
+  <w:num w:numId="1012">
     <w:abstractNumId w:val="991"/>
   </w:num>
-  <w:num w:numId="1012">
+  <w:num w:numId="1013">
     <w:abstractNumId w:val="99411"/>
     <w:lvlOverride w:ilvl="0">
       <w:startOverride w:val="1"/>

</xml_diff>

<commit_message>
feat(assignment-02): rewrite all five questions and the bonus
</commit_message>
<xml_diff>
--- a/assignments/02-assignment.docx
+++ b/assignments/02-assignment.docx
@@ -26,7 +26,7 @@
         <w:t xml:space="preserve">Emory University</w:t>
       </w:r>
     </w:p>
-    <w:bookmarkStart w:id="18" w:name="instructions"/>
+    <w:bookmarkStart w:id="17" w:name="instructions"/>
     <w:p>
       <w:pPr>
         <w:pStyle w:val="Heading2"/>
@@ -260,25 +260,7 @@
         <w:pStyle w:val="FirstParagraph"/>
       </w:pPr>
       <w:r>
-        <w:t xml:space="preserve">Ask ChatGPT, Claude, Gemini, or another LLM:</w:t>
-      </w:r>
-      <w:r>
-        <w:t xml:space="preserve"> </w:t>
-      </w:r>
-      <w:r>
-        <w:rPr>
-          <w:i/>
-          <w:iCs/>
-        </w:rPr>
-        <w:t xml:space="preserve">“Give me 5 real-world examples of AI applications.”</w:t>
-      </w:r>
-    </w:p>
-    <w:p>
-      <w:pPr>
-        <w:pStyle w:val="BodyText"/>
-      </w:pPr>
-      <w:r>
-        <w:t xml:space="preserve">For each example the LLM provides, identify which learning paradigm it uses:</w:t>
+        <w:t xml:space="preserve">For each system below, state which learning paradigm it uses (supervised, unsupervised or reinforcement), and what data it must have learned from.</w:t>
       </w:r>
     </w:p>
     <w:p>
@@ -288,71 +270,93 @@
           <w:ilvl w:val="0"/>
           <w:numId w:val="1002"/>
         </w:numPr>
+      </w:pPr>
+      <w:r>
+        <w:t xml:space="preserve">A hospital system reviews a chest X-ray and flags it as likely pneumonia</w:t>
+      </w:r>
+    </w:p>
+    <w:p>
+      <w:pPr>
+        <w:pStyle w:val="Compact"/>
+        <w:numPr>
+          <w:ilvl w:val="0"/>
+          <w:numId w:val="1002"/>
+        </w:numPr>
+      </w:pPr>
+      <w:r>
+        <w:t xml:space="preserve">A delivery app tells you your order will arrive in 23 minutes</w:t>
+      </w:r>
+    </w:p>
+    <w:p>
+      <w:pPr>
+        <w:pStyle w:val="Compact"/>
+        <w:numPr>
+          <w:ilvl w:val="0"/>
+          <w:numId w:val="1002"/>
+        </w:numPr>
+      </w:pPr>
+      <w:r>
+        <w:t xml:space="preserve">A data centre adjusts its cooling equipment and uses less energy every month</w:t>
+      </w:r>
+    </w:p>
+    <w:p>
+      <w:pPr>
+        <w:pStyle w:val="Compact"/>
+        <w:numPr>
+          <w:ilvl w:val="0"/>
+          <w:numId w:val="1002"/>
+        </w:numPr>
+      </w:pPr>
+      <w:r>
+        <w:t xml:space="preserve">A news app displays today’s articles about the same event together</w:t>
+      </w:r>
+    </w:p>
+    <w:p>
+      <w:pPr>
+        <w:pStyle w:val="Compact"/>
+        <w:numPr>
+          <w:ilvl w:val="0"/>
+          <w:numId w:val="1002"/>
+        </w:numPr>
+      </w:pPr>
+      <w:r>
+        <w:t xml:space="preserve">ChatGPT</w:t>
+      </w:r>
+    </w:p>
+    <w:p>
+      <w:pPr>
+        <w:pStyle w:val="FirstParagraph"/>
       </w:pPr>
       <w:r>
         <w:rPr>
           <w:b/>
           <w:bCs/>
         </w:rPr>
-        <w:t xml:space="preserve">Supervised learning</w:t>
-      </w:r>
-      <w:r>
-        <w:t xml:space="preserve"> </w:t>
-      </w:r>
-      <w:r>
-        <w:t xml:space="preserve">(learns from labelled examples)</w:t>
-      </w:r>
-    </w:p>
-    <w:p>
-      <w:pPr>
-        <w:pStyle w:val="Compact"/>
-        <w:numPr>
-          <w:ilvl w:val="0"/>
-          <w:numId w:val="1002"/>
-        </w:numPr>
-      </w:pPr>
-      <w:r>
-        <w:rPr>
-          <w:b/>
-          <w:bCs/>
-        </w:rPr>
-        <w:t xml:space="preserve">Unsupervised learning</w:t>
-      </w:r>
-      <w:r>
-        <w:t xml:space="preserve"> </w:t>
-      </w:r>
-      <w:r>
-        <w:t xml:space="preserve">(finds patterns without labels)</w:t>
-      </w:r>
-    </w:p>
-    <w:p>
-      <w:pPr>
-        <w:pStyle w:val="Compact"/>
-        <w:numPr>
-          <w:ilvl w:val="0"/>
-          <w:numId w:val="1002"/>
-        </w:numPr>
-      </w:pPr>
-      <w:r>
-        <w:rPr>
-          <w:b/>
-          <w:bCs/>
-        </w:rPr>
-        <w:t xml:space="preserve">Reinforcement learning</w:t>
-      </w:r>
-      <w:r>
-        <w:t xml:space="preserve"> </w:t>
-      </w:r>
-      <w:r>
-        <w:t xml:space="preserve">(learns from rewards and trial-and-error)</w:t>
-      </w:r>
-    </w:p>
-    <w:p>
-      <w:pPr>
-        <w:pStyle w:val="FirstParagraph"/>
-      </w:pPr>
-      <w:r>
-        <w:t xml:space="preserve">Explain your reasoning for each classification. If you’re uncertain about any example, explain why it’s ambiguous.</w:t>
+        <w:t xml:space="preserve">Then:</w:t>
+      </w:r>
+    </w:p>
+    <w:p>
+      <w:pPr>
+        <w:pStyle w:val="Compact"/>
+        <w:numPr>
+          <w:ilvl w:val="0"/>
+          <w:numId w:val="1003"/>
+        </w:numPr>
+      </w:pPr>
+      <w:r>
+        <w:t xml:space="preserve">Exactly one of the five combines two paradigms. Identify it and name both</w:t>
+      </w:r>
+    </w:p>
+    <w:p>
+      <w:pPr>
+        <w:pStyle w:val="Compact"/>
+        <w:numPr>
+          <w:ilvl w:val="0"/>
+          <w:numId w:val="1003"/>
+        </w:numPr>
+      </w:pPr>
+      <w:r>
+        <w:t xml:space="preserve">Answer everything above before asking an LLM. Then ask one to check your work, and report anything it disagreed with you about</w:t>
       </w:r>
     </w:p>
     <w:p>
@@ -406,13 +410,13 @@
       </w:r>
     </w:p>
     <w:bookmarkEnd w:id="9"/>
-    <w:bookmarkStart w:id="10" w:name="question-2-confusion-matrix-builder"/>
+    <w:bookmarkStart w:id="10" w:name="question-2-reading-a-confusion-matrix"/>
     <w:p>
       <w:pPr>
         <w:pStyle w:val="Heading3"/>
       </w:pPr>
       <w:r>
-        <w:t xml:space="preserve">Question 2: Confusion Matrix Builder</w:t>
+        <w:t xml:space="preserve">Question 2: Reading a confusion matrix</w:t>
       </w:r>
     </w:p>
     <w:p>
@@ -420,19 +424,19 @@
         <w:pStyle w:val="FirstParagraph"/>
       </w:pPr>
       <w:r>
-        <w:t xml:space="preserve">Ask an LLM to generate a confusion matrix for a spam filter with the following results:</w:t>
-      </w:r>
-    </w:p>
-    <w:p>
-      <w:pPr>
-        <w:pStyle w:val="Compact"/>
-        <w:numPr>
-          <w:ilvl w:val="0"/>
-          <w:numId w:val="1003"/>
-        </w:numPr>
-      </w:pPr>
-      <w:r>
-        <w:t xml:space="preserve">Correctly identifies</w:t>
+        <w:t xml:space="preserve">A bank tests a fraud detection system on 10,000 transactions, of which 100 are fraudulent. The results:</w:t>
+      </w:r>
+    </w:p>
+    <w:p>
+      <w:pPr>
+        <w:pStyle w:val="Compact"/>
+        <w:numPr>
+          <w:ilvl w:val="0"/>
+          <w:numId w:val="1004"/>
+        </w:numPr>
+      </w:pPr>
+      <w:r>
+        <w:t xml:space="preserve">Correctly flags</w:t>
       </w:r>
       <w:r>
         <w:t xml:space="preserve"> </w:t>
@@ -442,7 +446,7 @@
           <w:b/>
           <w:bCs/>
         </w:rPr>
-        <w:t xml:space="preserve">90 spam emails</w:t>
+        <w:t xml:space="preserve">20 fraudulent transactions</w:t>
       </w:r>
       <w:r>
         <w:t xml:space="preserve"> </w:t>
@@ -456,7 +460,7 @@
         <w:pStyle w:val="Compact"/>
         <w:numPr>
           <w:ilvl w:val="0"/>
-          <w:numId w:val="1003"/>
+          <w:numId w:val="1004"/>
         </w:numPr>
       </w:pPr>
       <w:r>
@@ -470,25 +474,25 @@
           <w:b/>
           <w:bCs/>
         </w:rPr>
-        <w:t xml:space="preserve">10 spam emails</w:t>
-      </w:r>
-      <w:r>
-        <w:t xml:space="preserve"> </w:t>
-      </w:r>
-      <w:r>
-        <w:t xml:space="preserve">that go to the inbox (False Negatives)</w:t>
-      </w:r>
-    </w:p>
-    <w:p>
-      <w:pPr>
-        <w:pStyle w:val="Compact"/>
-        <w:numPr>
-          <w:ilvl w:val="0"/>
-          <w:numId w:val="1003"/>
-        </w:numPr>
-      </w:pPr>
-      <w:r>
-        <w:t xml:space="preserve">Correctly identifies</w:t>
+        <w:t xml:space="preserve">80 fraudulent transactions</w:t>
+      </w:r>
+      <w:r>
+        <w:t xml:space="preserve"> </w:t>
+      </w:r>
+      <w:r>
+        <w:t xml:space="preserve">(False Negatives)</w:t>
+      </w:r>
+    </w:p>
+    <w:p>
+      <w:pPr>
+        <w:pStyle w:val="Compact"/>
+        <w:numPr>
+          <w:ilvl w:val="0"/>
+          <w:numId w:val="1004"/>
+        </w:numPr>
+      </w:pPr>
+      <w:r>
+        <w:t xml:space="preserve">Correctly clears</w:t>
       </w:r>
       <w:r>
         <w:t xml:space="preserve"> </w:t>
@@ -498,7 +502,7 @@
           <w:b/>
           <w:bCs/>
         </w:rPr>
-        <w:t xml:space="preserve">900 legitimate emails</w:t>
+        <w:t xml:space="preserve">9,880 legitimate transactions</w:t>
       </w:r>
       <w:r>
         <w:t xml:space="preserve"> </w:t>
@@ -512,11 +516,11 @@
         <w:pStyle w:val="Compact"/>
         <w:numPr>
           <w:ilvl w:val="0"/>
-          <w:numId w:val="1003"/>
-        </w:numPr>
-      </w:pPr>
-      <w:r>
-        <w:t xml:space="preserve">Wrongly marks</w:t>
+          <w:numId w:val="1004"/>
+        </w:numPr>
+      </w:pPr>
+      <w:r>
+        <w:t xml:space="preserve">Wrongly flags</w:t>
       </w:r>
       <w:r>
         <w:t xml:space="preserve"> </w:t>
@@ -526,57 +530,33 @@
           <w:b/>
           <w:bCs/>
         </w:rPr>
-        <w:t xml:space="preserve">5 legitimate emails</w:t>
-      </w:r>
-      <w:r>
-        <w:t xml:space="preserve"> </w:t>
-      </w:r>
-      <w:r>
-        <w:t xml:space="preserve">as spam (False Positives)</w:t>
+        <w:t xml:space="preserve">20 legitimate transactions</w:t>
+      </w:r>
+      <w:r>
+        <w:t xml:space="preserve"> </w:t>
+      </w:r>
+      <w:r>
+        <w:t xml:space="preserve">as fraud (False Positives)</w:t>
       </w:r>
     </w:p>
     <w:p>
       <w:pPr>
         <w:pStyle w:val="FirstParagraph"/>
       </w:pPr>
-      <w:r>
-        <w:t xml:space="preserve">Based on this confusion matrix:</w:t>
-      </w:r>
-    </w:p>
-    <w:p>
-      <w:pPr>
-        <w:pStyle w:val="Compact"/>
-        <w:numPr>
-          <w:ilvl w:val="0"/>
-          <w:numId w:val="1004"/>
-        </w:numPr>
-      </w:pPr>
-      <w:r>
-        <w:t xml:space="preserve">Calculate the</w:t>
-      </w:r>
-      <w:r>
-        <w:t xml:space="preserve"> </w:t>
-      </w:r>
       <w:r>
         <w:rPr>
           <w:b/>
           <w:bCs/>
         </w:rPr>
-        <w:t xml:space="preserve">precision</w:t>
-      </w:r>
-      <w:r>
-        <w:t xml:space="preserve"> </w:t>
-      </w:r>
-      <w:r>
-        <w:t xml:space="preserve">of this spam filter (you can ask the LLM to explain what the concepts are if you are not familiar with them)</w:t>
-      </w:r>
-    </w:p>
-    <w:p>
-      <w:pPr>
-        <w:pStyle w:val="Compact"/>
-        <w:numPr>
-          <w:ilvl w:val="0"/>
-          <w:numId w:val="1004"/>
+        <w:t xml:space="preserve">Your task:</w:t>
+      </w:r>
+    </w:p>
+    <w:p>
+      <w:pPr>
+        <w:pStyle w:val="Compact"/>
+        <w:numPr>
+          <w:ilvl w:val="0"/>
+          <w:numId w:val="1005"/>
         </w:numPr>
       </w:pPr>
       <w:r>
@@ -590,25 +570,66 @@
           <w:b/>
           <w:bCs/>
         </w:rPr>
+        <w:t xml:space="preserve">accuracy</w:t>
+      </w:r>
+      <w:r>
+        <w:t xml:space="preserve">,</w:t>
+      </w:r>
+      <w:r>
+        <w:t xml:space="preserve"> </w:t>
+      </w:r>
+      <w:r>
+        <w:rPr>
+          <w:b/>
+          <w:bCs/>
+        </w:rPr>
+        <w:t xml:space="preserve">precision</w:t>
+      </w:r>
+      <w:r>
+        <w:t xml:space="preserve"> </w:t>
+      </w:r>
+      <w:r>
+        <w:t xml:space="preserve">and</w:t>
+      </w:r>
+      <w:r>
+        <w:t xml:space="preserve"> </w:t>
+      </w:r>
+      <w:r>
+        <w:rPr>
+          <w:b/>
+          <w:bCs/>
+        </w:rPr>
         <w:t xml:space="preserve">recall</w:t>
       </w:r>
       <w:r>
         <w:t xml:space="preserve"> </w:t>
       </w:r>
       <w:r>
-        <w:t xml:space="preserve">of this spam filter</w:t>
-      </w:r>
-    </w:p>
-    <w:p>
-      <w:pPr>
-        <w:pStyle w:val="Compact"/>
-        <w:numPr>
-          <w:ilvl w:val="0"/>
-          <w:numId w:val="1004"/>
-        </w:numPr>
-      </w:pPr>
-      <w:r>
-        <w:t xml:space="preserve">Which metric would you prioritise for a spam filter, and why? Consider the costs of each type of error.</w:t>
+        <w:t xml:space="preserve">of this system. Show your working. You may ask an LLM to explain what these metrics mean, but do the arithmetic yourself</w:t>
+      </w:r>
+    </w:p>
+    <w:p>
+      <w:pPr>
+        <w:pStyle w:val="Compact"/>
+        <w:numPr>
+          <w:ilvl w:val="0"/>
+          <w:numId w:val="1005"/>
+        </w:numPr>
+      </w:pPr>
+      <w:r>
+        <w:t xml:space="preserve">The vendor advertises the system using its accuracy. Explain what that number hides</w:t>
+      </w:r>
+    </w:p>
+    <w:p>
+      <w:pPr>
+        <w:pStyle w:val="Compact"/>
+        <w:numPr>
+          <w:ilvl w:val="0"/>
+          <w:numId w:val="1005"/>
+        </w:numPr>
+      </w:pPr>
+      <w:r>
+        <w:t xml:space="preserve">Which of the two errors costs the bank more, and which metric would you prioritise? Say what you would give up in exchange</w:t>
       </w:r>
     </w:p>
     <w:p>
@@ -662,7 +683,7 @@
       </w:r>
     </w:p>
     <w:bookmarkEnd w:id="10"/>
-    <w:bookmarkStart w:id="13" w:name="question-3-temperature-experiment"/>
+    <w:bookmarkStart w:id="12" w:name="question-3-temperature-experiment"/>
     <w:p>
       <w:pPr>
         <w:pStyle w:val="Heading3"/>
@@ -692,33 +713,15 @@
         <w:t xml:space="preserve"> </w:t>
       </w:r>
       <w:r>
-        <w:t xml:space="preserve">parameter controls how random or deterministic an LLM’s responses are. In this question, you’ll experiment with temperature settings.</w:t>
-      </w:r>
-    </w:p>
-    <w:p>
-      <w:pPr>
-        <w:pStyle w:val="BodyText"/>
-      </w:pPr>
-      <w:r>
-        <w:rPr>
-          <w:b/>
-          <w:bCs/>
-        </w:rPr>
-        <w:t xml:space="preserve">Option A: Use Google AI Studio</w:t>
-      </w:r>
-      <w:r>
-        <w:t xml:space="preserve"> </w:t>
-      </w:r>
-      <w:r>
-        <w:t xml:space="preserve">(recommended for this experiment)</w:t>
-      </w:r>
-    </w:p>
-    <w:p>
-      <w:pPr>
-        <w:pStyle w:val="Compact"/>
-        <w:numPr>
-          <w:ilvl w:val="0"/>
-          <w:numId w:val="1005"/>
+        <w:t xml:space="preserve">setting controls how random an LLM’s output is.</w:t>
+      </w:r>
+    </w:p>
+    <w:p>
+      <w:pPr>
+        <w:pStyle w:val="Compact"/>
+        <w:numPr>
+          <w:ilvl w:val="0"/>
+          <w:numId w:val="1006"/>
         </w:numPr>
       </w:pPr>
       <w:r>
@@ -735,41 +738,87 @@
           <w:t xml:space="preserve">aistudio.google.com</w:t>
         </w:r>
       </w:hyperlink>
-    </w:p>
-    <w:p>
-      <w:pPr>
-        <w:pStyle w:val="Compact"/>
-        <w:numPr>
-          <w:ilvl w:val="0"/>
-          <w:numId w:val="1005"/>
-        </w:numPr>
-      </w:pPr>
-      <w:r>
-        <w:t xml:space="preserve">Sign in with your Google account</w:t>
-      </w:r>
-    </w:p>
-    <w:p>
-      <w:pPr>
-        <w:pStyle w:val="Compact"/>
-        <w:numPr>
-          <w:ilvl w:val="0"/>
-          <w:numId w:val="1005"/>
-        </w:numPr>
-      </w:pPr>
-      <w:r>
-        <w:t xml:space="preserve">Find the temperature slider in the settings panel</w:t>
-      </w:r>
-    </w:p>
-    <w:p>
-      <w:pPr>
-        <w:pStyle w:val="Compact"/>
-        <w:numPr>
-          <w:ilvl w:val="0"/>
-          <w:numId w:val="1005"/>
-        </w:numPr>
-      </w:pPr>
-      <w:r>
-        <w:t xml:space="preserve">Ask the same creative question (e.g.,</w:t>
+      <w:r>
+        <w:t xml:space="preserve"> </w:t>
+      </w:r>
+      <w:r>
+        <w:t xml:space="preserve">and sign in. In the settings panel, turn</w:t>
+      </w:r>
+      <w:r>
+        <w:t xml:space="preserve"> </w:t>
+      </w:r>
+      <w:r>
+        <w:rPr>
+          <w:b/>
+          <w:bCs/>
+        </w:rPr>
+        <w:t xml:space="preserve">off</w:t>
+      </w:r>
+      <w:r>
+        <w:t xml:space="preserve"> </w:t>
+      </w:r>
+      <w:r>
+        <w:t xml:space="preserve">“Grounding with Google Search”</w:t>
+      </w:r>
+      <w:r>
+        <w:t xml:space="preserve"> </w:t>
+      </w:r>
+      <w:r>
+        <w:t xml:space="preserve">and set</w:t>
+      </w:r>
+      <w:r>
+        <w:t xml:space="preserve"> </w:t>
+      </w:r>
+      <w:r>
+        <w:rPr>
+          <w:b/>
+          <w:bCs/>
+        </w:rPr>
+        <w:t xml:space="preserve">Thinking level</w:t>
+      </w:r>
+      <w:r>
+        <w:t xml:space="preserve"> </w:t>
+      </w:r>
+      <w:r>
+        <w:t xml:space="preserve">to</w:t>
+      </w:r>
+      <w:r>
+        <w:t xml:space="preserve"> </w:t>
+      </w:r>
+      <w:r>
+        <w:rPr>
+          <w:b/>
+          <w:bCs/>
+        </w:rPr>
+        <w:t xml:space="preserve">Minimum</w:t>
+      </w:r>
+      <w:r>
+        <w:t xml:space="preserve">. Both of these interfere with the experiment</w:t>
+      </w:r>
+    </w:p>
+    <w:p>
+      <w:pPr>
+        <w:pStyle w:val="Compact"/>
+        <w:numPr>
+          <w:ilvl w:val="0"/>
+          <w:numId w:val="1006"/>
+        </w:numPr>
+      </w:pPr>
+      <w:r>
+        <w:t xml:space="preserve">Set the temperature to</w:t>
+      </w:r>
+      <w:r>
+        <w:t xml:space="preserve"> </w:t>
+      </w:r>
+      <w:r>
+        <w:rPr>
+          <w:b/>
+          <w:bCs/>
+        </w:rPr>
+        <w:t xml:space="preserve">0</w:t>
+      </w:r>
+      <w:r>
+        <w:t xml:space="preserve">. Send the prompt</w:t>
       </w:r>
       <w:r>
         <w:t xml:space="preserve"> </w:t>
@@ -779,131 +828,78 @@
           <w:i/>
           <w:iCs/>
         </w:rPr>
-        <w:t xml:space="preserve">“Write a short poem about machine learning”</w:t>
-      </w:r>
-      <w:r>
-        <w:t xml:space="preserve">) at:</w:t>
-      </w:r>
-    </w:p>
-    <w:p>
-      <w:pPr>
-        <w:pStyle w:val="Compact"/>
-        <w:numPr>
-          <w:ilvl w:val="1"/>
-          <w:numId w:val="1006"/>
-        </w:numPr>
-      </w:pPr>
-      <w:r>
-        <w:t xml:space="preserve">Low temperature (0.1 or 0.2)</w:t>
-      </w:r>
-    </w:p>
-    <w:p>
-      <w:pPr>
-        <w:pStyle w:val="Compact"/>
-        <w:numPr>
-          <w:ilvl w:val="1"/>
-          <w:numId w:val="1006"/>
-        </w:numPr>
-      </w:pPr>
-      <w:r>
-        <w:t xml:space="preserve">High temperature (0.9 or 1.0)</w:t>
-      </w:r>
-    </w:p>
-    <w:p>
-      <w:pPr>
-        <w:pStyle w:val="Compact"/>
-        <w:numPr>
-          <w:ilvl w:val="0"/>
-          <w:numId w:val="1005"/>
-        </w:numPr>
-      </w:pPr>
-      <w:r>
-        <w:t xml:space="preserve">Ask the same question multiple times at each temperature setting</w:t>
-      </w:r>
-    </w:p>
-    <w:p>
-      <w:pPr>
-        <w:pStyle w:val="FirstParagraph"/>
-      </w:pPr>
+        <w:t xml:space="preserve">“Write a six-word story about the sea.”</w:t>
+      </w:r>
+      <w:r>
+        <w:t xml:space="preserve"> </w:t>
+      </w:r>
+      <w:r>
+        <w:t xml:space="preserve">three times,</w:t>
+      </w:r>
+      <w:r>
+        <w:t xml:space="preserve"> </w:t>
+      </w:r>
       <w:r>
         <w:rPr>
           <w:b/>
           <w:bCs/>
         </w:rPr>
-        <w:t xml:space="preserve">Option B: Use ChatGPT</w:t>
-      </w:r>
-    </w:p>
-    <w:p>
-      <w:pPr>
-        <w:pStyle w:val="Compact"/>
-        <w:numPr>
-          <w:ilvl w:val="0"/>
-          <w:numId w:val="1007"/>
-        </w:numPr>
-      </w:pPr>
-      <w:r>
-        <w:t xml:space="preserve">Go to</w:t>
-      </w:r>
-      <w:r>
-        <w:t xml:space="preserve"> </w:t>
-      </w:r>
-      <w:hyperlink r:id="rId12">
-        <w:r>
-          <w:rPr>
-            <w:rStyle w:val="Hyperlink"/>
-          </w:rPr>
-          <w:t xml:space="preserve">chat.openai.com</w:t>
-        </w:r>
-      </w:hyperlink>
-    </w:p>
-    <w:p>
-      <w:pPr>
-        <w:pStyle w:val="Compact"/>
-        <w:numPr>
-          <w:ilvl w:val="0"/>
-          <w:numId w:val="1007"/>
-        </w:numPr>
-      </w:pPr>
-      <w:r>
-        <w:t xml:space="preserve">Try prompting ChatGPT to be</w:t>
-      </w:r>
-      <w:r>
-        <w:t xml:space="preserve"> </w:t>
-      </w:r>
-      <w:r>
-        <w:t xml:space="preserve">“very factual and deterministic”</w:t>
-      </w:r>
-      <w:r>
-        <w:t xml:space="preserve"> </w:t>
-      </w:r>
-      <w:r>
-        <w:t xml:space="preserve">vs. </w:t>
-      </w:r>
-      <w:r>
-        <w:t xml:space="preserve">“very creative and varied”</w:t>
-      </w:r>
-    </w:p>
-    <w:p>
-      <w:pPr>
-        <w:pStyle w:val="Compact"/>
-        <w:numPr>
-          <w:ilvl w:val="0"/>
-          <w:numId w:val="1007"/>
-        </w:numPr>
-      </w:pPr>
-      <w:r>
-        <w:t xml:space="preserve">Ask the same question multiple times in each mode</w:t>
-      </w:r>
-    </w:p>
-    <w:p>
-      <w:pPr>
-        <w:pStyle w:val="FirstParagraph"/>
-      </w:pPr>
+        <w:t xml:space="preserve">starting a new chat each time</w:t>
+      </w:r>
+      <w:r>
+        <w:t xml:space="preserve">. You can start one quickly with the</w:t>
+      </w:r>
+      <w:r>
+        <w:t xml:space="preserve"> </w:t>
+      </w:r>
       <w:r>
         <w:rPr>
           <w:b/>
           <w:bCs/>
         </w:rPr>
+        <w:t xml:space="preserve">+</w:t>
+      </w:r>
+      <w:r>
+        <w:t xml:space="preserve"> </w:t>
+      </w:r>
+      <w:r>
+        <w:t xml:space="preserve">at the top of the page. Record all three</w:t>
+      </w:r>
+    </w:p>
+    <w:p>
+      <w:pPr>
+        <w:pStyle w:val="Compact"/>
+        <w:numPr>
+          <w:ilvl w:val="0"/>
+          <w:numId w:val="1006"/>
+        </w:numPr>
+      </w:pPr>
+      <w:r>
+        <w:t xml:space="preserve">Set the temperature to</w:t>
+      </w:r>
+      <w:r>
+        <w:t xml:space="preserve"> </w:t>
+      </w:r>
+      <w:r>
+        <w:rPr>
+          <w:b/>
+          <w:bCs/>
+        </w:rPr>
+        <w:t xml:space="preserve">2</w:t>
+      </w:r>
+      <w:r>
+        <w:t xml:space="preserve">. Repeat, and record all three</w:t>
+      </w:r>
+    </w:p>
+    <w:p>
+      <w:pPr>
+        <w:pStyle w:val="FirstParagraph"/>
+      </w:pPr>
+      <w:r>
+        <w:rPr>
+          <w:b/>
+          <w:bCs/>
+        </w:rPr>
         <w:t xml:space="preserve">Your task:</w:t>
       </w:r>
     </w:p>
@@ -912,35 +908,75 @@
         <w:pStyle w:val="Compact"/>
         <w:numPr>
           <w:ilvl w:val="0"/>
-          <w:numId w:val="1008"/>
-        </w:numPr>
-      </w:pPr>
-      <w:r>
-        <w:t xml:space="preserve">Document the responses you receive at different temperature settings (or different prompting styles)</w:t>
-      </w:r>
-    </w:p>
-    <w:p>
-      <w:pPr>
-        <w:pStyle w:val="Compact"/>
-        <w:numPr>
-          <w:ilvl w:val="0"/>
-          <w:numId w:val="1008"/>
-        </w:numPr>
-      </w:pPr>
-      <w:r>
-        <w:t xml:space="preserve">Do you notice any differences in creativity, variation, or consistency?</w:t>
-      </w:r>
-    </w:p>
-    <w:p>
-      <w:pPr>
-        <w:pStyle w:val="Compact"/>
-        <w:numPr>
-          <w:ilvl w:val="0"/>
-          <w:numId w:val="1008"/>
-        </w:numPr>
-      </w:pPr>
-      <w:r>
-        <w:t xml:space="preserve">If you don’t notice much difference, speculate on why that might be (consider: default settings, model guardrails, the type of question asked)</w:t>
+          <w:numId w:val="1007"/>
+        </w:numPr>
+      </w:pPr>
+      <w:r>
+        <w:t xml:space="preserve">Compare the three answers at each setting. What changed?</w:t>
+      </w:r>
+    </w:p>
+    <w:p>
+      <w:pPr>
+        <w:pStyle w:val="Compact"/>
+        <w:numPr>
+          <w:ilvl w:val="0"/>
+          <w:numId w:val="1007"/>
+        </w:numPr>
+      </w:pPr>
+      <w:r>
+        <w:t xml:space="preserve">At temperature 2, is the writing still coherent? Quote your worst result</w:t>
+      </w:r>
+    </w:p>
+    <w:p>
+      <w:pPr>
+        <w:pStyle w:val="Compact"/>
+        <w:numPr>
+          <w:ilvl w:val="0"/>
+          <w:numId w:val="1007"/>
+        </w:numPr>
+      </w:pPr>
+      <w:r>
+        <w:t xml:space="preserve">Now try</w:t>
+      </w:r>
+      <w:r>
+        <w:t xml:space="preserve"> </w:t>
+      </w:r>
+      <w:r>
+        <w:rPr>
+          <w:i/>
+          <w:iCs/>
+        </w:rPr>
+        <w:t xml:space="preserve">“Name a fruit. Answer with one word.”</w:t>
+      </w:r>
+      <w:r>
+        <w:t xml:space="preserve"> </w:t>
+      </w:r>
+      <w:r>
+        <w:t xml:space="preserve">at both settings. It probably says apple every time. Explain why temperature cannot fix that</w:t>
+      </w:r>
+    </w:p>
+    <w:p>
+      <w:pPr>
+        <w:pStyle w:val="Compact"/>
+        <w:numPr>
+          <w:ilvl w:val="0"/>
+          <w:numId w:val="1007"/>
+        </w:numPr>
+      </w:pPr>
+      <w:r>
+        <w:t xml:space="preserve">Telling ChatGPT to</w:t>
+      </w:r>
+      <w:r>
+        <w:t xml:space="preserve"> </w:t>
+      </w:r>
+      <w:r>
+        <w:t xml:space="preserve">“be more creative”</w:t>
+      </w:r>
+      <w:r>
+        <w:t xml:space="preserve"> </w:t>
+      </w:r>
+      <w:r>
+        <w:t xml:space="preserve">does not change its temperature. Explain what that instruction changes instead</w:t>
       </w:r>
     </w:p>
     <w:p>
@@ -993,14 +1029,14 @@
         </w:pict>
       </w:r>
     </w:p>
-    <w:bookmarkEnd w:id="13"/>
-    <w:bookmarkStart w:id="14" w:name="question-4-the-data-labelling-challenge"/>
+    <w:bookmarkEnd w:id="12"/>
+    <w:bookmarkStart w:id="13" w:name="question-4-which-rule-would-you-trust"/>
     <w:p>
       <w:pPr>
         <w:pStyle w:val="Heading3"/>
       </w:pPr>
       <w:r>
-        <w:t xml:space="preserve">Question 4: The Data Labelling Challenge</w:t>
+        <w:t xml:space="preserve">Question 4: Which rule would you trust?</w:t>
       </w:r>
     </w:p>
     <w:p>
@@ -1008,7 +1044,7 @@
         <w:pStyle w:val="FirstParagraph"/>
       </w:pPr>
       <w:r>
-        <w:t xml:space="preserve">Labelling data is one of the main bottlenecks in AI. It is time-consuming and expensive, and the quality of labels is a key factor in training effective models.</w:t>
+        <w:t xml:space="preserve">A shop wants to predict whether a customer will come back within 30 days. It has records for its last 10 customers, and builds two rules from them.</w:t>
       </w:r>
     </w:p>
     <w:p>
@@ -1020,111 +1056,79 @@
           <w:b/>
           <w:bCs/>
         </w:rPr>
-        <w:t xml:space="preserve">Your task:</w:t>
-      </w:r>
-    </w:p>
-    <w:p>
-      <w:pPr>
-        <w:pStyle w:val="Compact"/>
-        <w:numPr>
-          <w:ilvl w:val="0"/>
-          <w:numId w:val="1009"/>
-        </w:numPr>
-      </w:pPr>
-      <w:r>
-        <w:t xml:space="preserve">Ask an LLM:</w:t>
-      </w:r>
-      <w:r>
-        <w:t xml:space="preserve"> </w:t>
-      </w:r>
-      <w:r>
-        <w:rPr>
-          <w:i/>
-          <w:iCs/>
-        </w:rPr>
-        <w:t xml:space="preserve">“What are three alternatives to manually labelling data?”</w:t>
-      </w:r>
-    </w:p>
-    <w:p>
-      <w:pPr>
-        <w:pStyle w:val="Compact"/>
-        <w:numPr>
-          <w:ilvl w:val="0"/>
-          <w:numId w:val="1009"/>
-        </w:numPr>
-      </w:pPr>
-      <w:r>
-        <w:t xml:space="preserve">Copy the response.</w:t>
-      </w:r>
-    </w:p>
-    <w:p>
-      <w:pPr>
-        <w:pStyle w:val="Compact"/>
-        <w:numPr>
-          <w:ilvl w:val="0"/>
-          <w:numId w:val="1009"/>
-        </w:numPr>
-      </w:pPr>
-      <w:r>
-        <w:t xml:space="preserve">Ask:</w:t>
-      </w:r>
-      <w:r>
-        <w:t xml:space="preserve"> </w:t>
-      </w:r>
-      <w:r>
-        <w:rPr>
-          <w:i/>
-          <w:iCs/>
-        </w:rPr>
-        <w:t xml:space="preserve">“Why do different people often give the same example different labels, and how do annotation guidelines help?”</w:t>
-      </w:r>
-    </w:p>
-    <w:p>
-      <w:pPr>
-        <w:pStyle w:val="Compact"/>
-        <w:numPr>
-          <w:ilvl w:val="0"/>
-          <w:numId w:val="1009"/>
-        </w:numPr>
-      </w:pPr>
-      <w:r>
-        <w:t xml:space="preserve">Copy the response.</w:t>
-      </w:r>
-    </w:p>
-    <w:p>
-      <w:pPr>
-        <w:pStyle w:val="FirstParagraph"/>
+        <w:t xml:space="preserve">Rule A</w:t>
+      </w:r>
+      <w:r>
+        <w:t xml:space="preserve"> </w:t>
+      </w:r>
+      <w:r>
+        <w:t xml:space="preserve">predicts a customer will return if they spent over $40, paid by card, bought more than two items, came on a weekday, are aged 25 to 34, and live within three miles. It classifies all 10 past customers correctly.</w:t>
+      </w:r>
+    </w:p>
+    <w:p>
+      <w:pPr>
+        <w:pStyle w:val="BodyText"/>
       </w:pPr>
       <w:r>
         <w:rPr>
           <w:b/>
           <w:bCs/>
         </w:rPr>
-        <w:t xml:space="preserve">Analysis:</w:t>
-      </w:r>
-    </w:p>
-    <w:p>
-      <w:pPr>
-        <w:pStyle w:val="Compact"/>
-        <w:numPr>
-          <w:ilvl w:val="0"/>
-          <w:numId w:val="1010"/>
-        </w:numPr>
-      </w:pPr>
-      <w:r>
-        <w:t xml:space="preserve">In your own words, explain why the quality of labels matters as much as the quantity</w:t>
-      </w:r>
-    </w:p>
-    <w:p>
-      <w:pPr>
-        <w:pStyle w:val="Compact"/>
-        <w:numPr>
-          <w:ilvl w:val="0"/>
-          <w:numId w:val="1010"/>
-        </w:numPr>
-      </w:pPr>
-      <w:r>
-        <w:t xml:space="preserve">What could go wrong if you train an AI system on poorly labelled data?</w:t>
+        <w:t xml:space="preserve">Rule B</w:t>
+      </w:r>
+      <w:r>
+        <w:t xml:space="preserve"> </w:t>
+      </w:r>
+      <w:r>
+        <w:t xml:space="preserve">predicts a customer will return if they spent over $40. It gets 8 of the 10 right.</w:t>
+      </w:r>
+    </w:p>
+    <w:p>
+      <w:pPr>
+        <w:pStyle w:val="BodyText"/>
+      </w:pPr>
+      <w:r>
+        <w:rPr>
+          <w:b/>
+          <w:bCs/>
+        </w:rPr>
+        <w:t xml:space="preserve">Your task:</w:t>
+      </w:r>
+    </w:p>
+    <w:p>
+      <w:pPr>
+        <w:pStyle w:val="Compact"/>
+        <w:numPr>
+          <w:ilvl w:val="0"/>
+          <w:numId w:val="1008"/>
+        </w:numPr>
+      </w:pPr>
+      <w:r>
+        <w:t xml:space="preserve">The shop is about to apply one rule to its next 1,000 customers. Which would you choose, and what accuracy would you expect from each?</w:t>
+      </w:r>
+    </w:p>
+    <w:p>
+      <w:pPr>
+        <w:pStyle w:val="Compact"/>
+        <w:numPr>
+          <w:ilvl w:val="0"/>
+          <w:numId w:val="1008"/>
+        </w:numPr>
+      </w:pPr>
+      <w:r>
+        <w:t xml:space="preserve">Rule A is perfect on the data it was built from. Name what has gone wrong, and explain why adding conditions made it worse</w:t>
+      </w:r>
+    </w:p>
+    <w:p>
+      <w:pPr>
+        <w:pStyle w:val="Compact"/>
+        <w:numPr>
+          <w:ilvl w:val="0"/>
+          <w:numId w:val="1008"/>
+        </w:numPr>
+      </w:pPr>
+      <w:r>
+        <w:t xml:space="preserve">The shop has no new customers yet. Using only the 10 records it already has, how could it have caught this problem before deploying?</w:t>
       </w:r>
     </w:p>
     <w:p>
@@ -1177,8 +1181,8 @@
         </w:pict>
       </w:r>
     </w:p>
-    <w:bookmarkEnd w:id="14"/>
-    <w:bookmarkStart w:id="16" w:name="question-5-seeing-like-a-tokeniser"/>
+    <w:bookmarkEnd w:id="13"/>
+    <w:bookmarkStart w:id="15" w:name="question-5-seeing-like-a-tokeniser"/>
     <w:p>
       <w:pPr>
         <w:pStyle w:val="Heading3"/>
@@ -1212,7 +1216,7 @@
         <w:pStyle w:val="Compact"/>
         <w:numPr>
           <w:ilvl w:val="0"/>
-          <w:numId w:val="1011"/>
+          <w:numId w:val="1009"/>
         </w:numPr>
       </w:pPr>
       <w:r>
@@ -1221,7 +1225,7 @@
       <w:r>
         <w:t xml:space="preserve"> </w:t>
       </w:r>
-      <w:hyperlink r:id="rId15">
+      <w:hyperlink r:id="rId14">
         <w:r>
           <w:rPr>
             <w:rStyle w:val="Hyperlink"/>
@@ -1229,13 +1233,35 @@
           <w:t xml:space="preserve">platform.openai.com/tokenizer</w:t>
         </w:r>
       </w:hyperlink>
-    </w:p>
-    <w:p>
-      <w:pPr>
-        <w:pStyle w:val="Compact"/>
-        <w:numPr>
-          <w:ilvl w:val="0"/>
-          <w:numId w:val="1011"/>
+      <w:r>
+        <w:t xml:space="preserve"> </w:t>
+      </w:r>
+      <w:r>
+        <w:t xml:space="preserve">and select the</w:t>
+      </w:r>
+      <w:r>
+        <w:t xml:space="preserve"> </w:t>
+      </w:r>
+      <w:r>
+        <w:rPr>
+          <w:b/>
+          <w:bCs/>
+        </w:rPr>
+        <w:t xml:space="preserve">“GPT-5.x &amp; O1/3”</w:t>
+      </w:r>
+      <w:r>
+        <w:t xml:space="preserve"> </w:t>
+      </w:r>
+      <w:r>
+        <w:t xml:space="preserve">tokeniser</w:t>
+      </w:r>
+    </w:p>
+    <w:p>
+      <w:pPr>
+        <w:pStyle w:val="Compact"/>
+        <w:numPr>
+          <w:ilvl w:val="0"/>
+          <w:numId w:val="1009"/>
         </w:numPr>
       </w:pPr>
       <w:r>
@@ -1263,7 +1289,7 @@
         <w:pStyle w:val="Compact"/>
         <w:numPr>
           <w:ilvl w:val="0"/>
-          <w:numId w:val="1011"/>
+          <w:numId w:val="1009"/>
         </w:numPr>
       </w:pPr>
       <w:r>
@@ -1283,19 +1309,19 @@
         <w:t xml:space="preserve"> </w:t>
       </w:r>
       <w:r>
-        <w:t xml:space="preserve">and record the token count</w:t>
-      </w:r>
-    </w:p>
-    <w:p>
-      <w:pPr>
-        <w:pStyle w:val="Compact"/>
-        <w:numPr>
-          <w:ilvl w:val="0"/>
-          <w:numId w:val="1011"/>
-        </w:numPr>
-      </w:pPr>
-      <w:r>
-        <w:t xml:space="preserve">Paste the words</w:t>
+        <w:t xml:space="preserve">and record the count</w:t>
+      </w:r>
+    </w:p>
+    <w:p>
+      <w:pPr>
+        <w:pStyle w:val="Compact"/>
+        <w:numPr>
+          <w:ilvl w:val="0"/>
+          <w:numId w:val="1009"/>
+        </w:numPr>
+      </w:pPr>
+      <w:r>
+        <w:t xml:space="preserve">Paste the Hindi translation:</w:t>
       </w:r>
       <w:r>
         <w:t xml:space="preserve"> </w:t>
@@ -1305,13 +1331,25 @@
           <w:i/>
           <w:iCs/>
         </w:rPr>
-        <w:t xml:space="preserve">“unbelievable”</w:t>
-      </w:r>
-      <w:r>
-        <w:t xml:space="preserve"> </w:t>
-      </w:r>
-      <w:r>
-        <w:t xml:space="preserve">and</w:t>
+        <w:t xml:space="preserve">“फुर्तीली भूरी लोमड़ी आलसी कुत्ते के ऊपर कूदती है”</w:t>
+      </w:r>
+      <w:r>
+        <w:t xml:space="preserve"> </w:t>
+      </w:r>
+      <w:r>
+        <w:t xml:space="preserve">and record the count</w:t>
+      </w:r>
+    </w:p>
+    <w:p>
+      <w:pPr>
+        <w:pStyle w:val="Compact"/>
+        <w:numPr>
+          <w:ilvl w:val="0"/>
+          <w:numId w:val="1009"/>
+        </w:numPr>
+      </w:pPr>
+      <w:r>
+        <w:t xml:space="preserve">Paste the words</w:t>
       </w:r>
       <w:r>
         <w:t xml:space="preserve"> </w:t>
@@ -1321,6 +1359,22 @@
           <w:i/>
           <w:iCs/>
         </w:rPr>
+        <w:t xml:space="preserve">“unbelievable”</w:t>
+      </w:r>
+      <w:r>
+        <w:t xml:space="preserve"> </w:t>
+      </w:r>
+      <w:r>
+        <w:t xml:space="preserve">and</w:t>
+      </w:r>
+      <w:r>
+        <w:t xml:space="preserve"> </w:t>
+      </w:r>
+      <w:r>
+        <w:rPr>
+          <w:i/>
+          <w:iCs/>
+        </w:rPr>
         <w:t xml:space="preserve">“unbelievableness”</w:t>
       </w:r>
       <w:r>
@@ -1347,19 +1401,19 @@
         <w:pStyle w:val="Compact"/>
         <w:numPr>
           <w:ilvl w:val="0"/>
-          <w:numId w:val="1012"/>
-        </w:numPr>
-      </w:pPr>
-      <w:r>
-        <w:t xml:space="preserve">Does the Spanish sentence need more tokens than the English one? Record what you find</w:t>
-      </w:r>
-    </w:p>
-    <w:p>
-      <w:pPr>
-        <w:pStyle w:val="Compact"/>
-        <w:numPr>
-          <w:ilvl w:val="0"/>
-          <w:numId w:val="1012"/>
+          <w:numId w:val="1010"/>
+        </w:numPr>
+      </w:pPr>
+      <w:r>
+        <w:t xml:space="preserve">Which language needed the most tokens for the same sentence? Lecture 06 covered context windows: if your language needs three times as many tokens, what do you lose?</w:t>
+      </w:r>
+    </w:p>
+    <w:p>
+      <w:pPr>
+        <w:pStyle w:val="Compact"/>
+        <w:numPr>
+          <w:ilvl w:val="0"/>
+          <w:numId w:val="1010"/>
         </w:numPr>
       </w:pPr>
       <w:r>
@@ -1387,7 +1441,7 @@
         <w:pStyle w:val="Compact"/>
         <w:numPr>
           <w:ilvl w:val="0"/>
-          <w:numId w:val="1012"/>
+          <w:numId w:val="1010"/>
         </w:numPr>
       </w:pPr>
       <w:r>
@@ -1444,14 +1498,14 @@
         </w:pict>
       </w:r>
     </w:p>
-    <w:bookmarkEnd w:id="16"/>
-    <w:bookmarkStart w:id="17" w:name="bonus-question-can-machines-think"/>
+    <w:bookmarkEnd w:id="15"/>
+    <w:bookmarkStart w:id="16" w:name="Xe8ff7d5f3a1974e07e5aafe527bfebdf7ee82c3"/>
     <w:p>
       <w:pPr>
         <w:pStyle w:val="Heading3"/>
       </w:pPr>
       <w:r>
-        <w:t xml:space="preserve">Bonus Question: Can Machines Think?</w:t>
+        <w:t xml:space="preserve">Bonus Question: Whose values is it repeating?</w:t>
       </w:r>
     </w:p>
     <w:p>
@@ -1459,95 +1513,7 @@
         <w:pStyle w:val="FirstParagraph"/>
       </w:pPr>
       <w:r>
-        <w:t xml:space="preserve">In 1950, Alan Turing published</w:t>
-      </w:r>
-      <w:r>
-        <w:t xml:space="preserve"> </w:t>
-      </w:r>
-      <w:r>
-        <w:t xml:space="preserve">“Computing Machinery and Intelligence,”</w:t>
-      </w:r>
-      <w:r>
-        <w:t xml:space="preserve"> </w:t>
-      </w:r>
-      <w:r>
-        <w:t xml:space="preserve">where he proposed replacing the question</w:t>
-      </w:r>
-      <w:r>
-        <w:t xml:space="preserve"> </w:t>
-      </w:r>
-      <w:r>
-        <w:t xml:space="preserve">“Can machines think?”</w:t>
-      </w:r>
-      <w:r>
-        <w:t xml:space="preserve"> </w:t>
-      </w:r>
-      <w:r>
-        <w:t xml:space="preserve">with a practical test: can a machine fool a human into believing it is human? Turing argued that if a machine behaves indistinguishably from a thinking being, we have no good reason to deny it thinks.</w:t>
-      </w:r>
-    </w:p>
-    <w:p>
-      <w:pPr>
-        <w:pStyle w:val="BodyText"/>
-      </w:pPr>
-      <w:r>
-        <w:t xml:space="preserve">But not everyone agrees. Some philosophers argue there is a difference between</w:t>
-      </w:r>
-      <w:r>
-        <w:t xml:space="preserve"> </w:t>
-      </w:r>
-      <w:r>
-        <w:rPr>
-          <w:i/>
-          <w:iCs/>
-        </w:rPr>
-        <w:t xml:space="preserve">simulating</w:t>
-      </w:r>
-      <w:r>
-        <w:t xml:space="preserve"> </w:t>
-      </w:r>
-      <w:r>
-        <w:t xml:space="preserve">intelligence and</w:t>
-      </w:r>
-      <w:r>
-        <w:t xml:space="preserve"> </w:t>
-      </w:r>
-      <w:r>
-        <w:rPr>
-          <w:i/>
-          <w:iCs/>
-        </w:rPr>
-        <w:t xml:space="preserve">having</w:t>
-      </w:r>
-      <w:r>
-        <w:t xml:space="preserve"> </w:t>
-      </w:r>
-      <w:r>
-        <w:t xml:space="preserve">intelligence. A calculator can multiply faster than any human, but we don’t say it</w:t>
-      </w:r>
-      <w:r>
-        <w:t xml:space="preserve"> </w:t>
-      </w:r>
-      <w:r>
-        <w:t xml:space="preserve">“understands”</w:t>
-      </w:r>
-      <w:r>
-        <w:t xml:space="preserve"> </w:t>
-      </w:r>
-      <w:r>
-        <w:t xml:space="preserve">multiplication. A chatbot can write a poem, but does it</w:t>
-      </w:r>
-      <w:r>
-        <w:t xml:space="preserve"> </w:t>
-      </w:r>
-      <w:r>
-        <w:t xml:space="preserve">“understand”</w:t>
-      </w:r>
-      <w:r>
-        <w:t xml:space="preserve"> </w:t>
-      </w:r>
-      <w:r>
-        <w:t xml:space="preserve">poetry?</w:t>
+        <w:t xml:space="preserve">Lecture 04 covered RLHF: after pretraining, a model is tuned on human raters choosing between responses. Those raters were paid, worked to a rubric, and had deadlines. What the model learned is which answers those particular people preferred.</w:t>
       </w:r>
     </w:p>
     <w:p>
@@ -1564,35 +1530,38 @@
     </w:p>
     <w:p>
       <w:pPr>
-        <w:numPr>
-          <w:ilvl w:val="0"/>
-          <w:numId w:val="1013"/>
-        </w:numPr>
-      </w:pPr>
-      <w:r>
-        <w:t xml:space="preserve">Have a short conversation (at least 5 exchanges) with ChatGPT, Claude, or another LLM about a topic you care about. Pay attention to whether the responses feel like genuine understanding or sophisticated pattern matching.</w:t>
-      </w:r>
-    </w:p>
-    <w:p>
-      <w:pPr>
-        <w:numPr>
-          <w:ilvl w:val="0"/>
-          <w:numId w:val="1013"/>
-        </w:numPr>
-      </w:pPr>
-      <w:r>
-        <w:t xml:space="preserve">Take a position: is there a meaningful difference between simulating intelligence and having intelligence? Or is the distinction meaningless, since we can only ever judge intelligence by outward behaviour? Defend your view.</w:t>
-      </w:r>
-    </w:p>
-    <w:p>
-      <w:pPr>
-        <w:numPr>
-          <w:ilvl w:val="0"/>
-          <w:numId w:val="1013"/>
-        </w:numPr>
-      </w:pPr>
-      <w:r>
-        <w:t xml:space="preserve">Consider this thought experiment: if a future AI passes every test of intelligence we can design, responds emotionally, asks its own questions, and claims to be conscious, would you believe it? Why or why not?</w:t>
+        <w:pStyle w:val="Compact"/>
+        <w:numPr>
+          <w:ilvl w:val="0"/>
+          <w:numId w:val="1011"/>
+        </w:numPr>
+      </w:pPr>
+      <w:r>
+        <w:t xml:space="preserve">In assignment 01 you pushed a model into calling weak work A-grade. Explain how RLHF could have produced that behaviour</w:t>
+      </w:r>
+    </w:p>
+    <w:p>
+      <w:pPr>
+        <w:pStyle w:val="Compact"/>
+        <w:numPr>
+          <w:ilvl w:val="0"/>
+          <w:numId w:val="1011"/>
+        </w:numPr>
+      </w:pPr>
+      <w:r>
+        <w:t xml:space="preserve">Imagine a model that never flatters and never softens bad news. Describe what using it would feel like, and say honestly whether you would keep using it</w:t>
+      </w:r>
+    </w:p>
+    <w:p>
+      <w:pPr>
+        <w:pStyle w:val="Compact"/>
+        <w:numPr>
+          <w:ilvl w:val="0"/>
+          <w:numId w:val="1011"/>
+        </w:numPr>
+      </w:pPr>
+      <w:r>
+        <w:t xml:space="preserve">Whose values should a model hold: the raters’, the company’s, the user’s, or someone else’s? Defend one answer, and name what your choice costs</w:t>
       </w:r>
     </w:p>
     <w:p>
@@ -1638,8 +1607,8 @@
         <w:br/>
       </w:r>
     </w:p>
+    <w:bookmarkEnd w:id="16"/>
     <w:bookmarkEnd w:id="17"/>
-    <w:bookmarkEnd w:id="18"/>
     <w:sectPr>
       <w:footnotePr>
         <w:numRestart w:val="eachSect"/>
@@ -1978,34 +1947,7 @@
     <w:abstractNumId w:val="991"/>
   </w:num>
   <w:num w:numId="1004">
-    <w:abstractNumId w:val="99411"/>
-    <w:lvlOverride w:ilvl="0">
-      <w:startOverride w:val="1"/>
-    </w:lvlOverride>
-    <w:lvlOverride w:ilvl="1">
-      <w:startOverride w:val="1"/>
-    </w:lvlOverride>
-    <w:lvlOverride w:ilvl="2">
-      <w:startOverride w:val="1"/>
-    </w:lvlOverride>
-    <w:lvlOverride w:ilvl="3">
-      <w:startOverride w:val="1"/>
-    </w:lvlOverride>
-    <w:lvlOverride w:ilvl="4">
-      <w:startOverride w:val="1"/>
-    </w:lvlOverride>
-    <w:lvlOverride w:ilvl="5">
-      <w:startOverride w:val="1"/>
-    </w:lvlOverride>
-    <w:lvlOverride w:ilvl="6">
-      <w:startOverride w:val="1"/>
-    </w:lvlOverride>
-    <w:lvlOverride w:ilvl="7">
-      <w:startOverride w:val="1"/>
-    </w:lvlOverride>
-    <w:lvlOverride w:ilvl="8">
-      <w:startOverride w:val="1"/>
-    </w:lvlOverride>
+    <w:abstractNumId w:val="991"/>
   </w:num>
   <w:num w:numId="1005">
     <w:abstractNumId w:val="99411"/>
@@ -2038,9 +1980,39 @@
     </w:lvlOverride>
   </w:num>
   <w:num w:numId="1006">
+    <w:abstractNumId w:val="99411"/>
+    <w:lvlOverride w:ilvl="0">
+      <w:startOverride w:val="1"/>
+    </w:lvlOverride>
+    <w:lvlOverride w:ilvl="1">
+      <w:startOverride w:val="1"/>
+    </w:lvlOverride>
+    <w:lvlOverride w:ilvl="2">
+      <w:startOverride w:val="1"/>
+    </w:lvlOverride>
+    <w:lvlOverride w:ilvl="3">
+      <w:startOverride w:val="1"/>
+    </w:lvlOverride>
+    <w:lvlOverride w:ilvl="4">
+      <w:startOverride w:val="1"/>
+    </w:lvlOverride>
+    <w:lvlOverride w:ilvl="5">
+      <w:startOverride w:val="1"/>
+    </w:lvlOverride>
+    <w:lvlOverride w:ilvl="6">
+      <w:startOverride w:val="1"/>
+    </w:lvlOverride>
+    <w:lvlOverride w:ilvl="7">
+      <w:startOverride w:val="1"/>
+    </w:lvlOverride>
+    <w:lvlOverride w:ilvl="8">
+      <w:startOverride w:val="1"/>
+    </w:lvlOverride>
+  </w:num>
+  <w:num w:numId="1007">
     <w:abstractNumId w:val="991"/>
   </w:num>
-  <w:num w:numId="1007">
+  <w:num w:numId="1008">
     <w:abstractNumId w:val="99411"/>
     <w:lvlOverride w:ilvl="0">
       <w:startOverride w:val="1"/>
@@ -2069,9 +2041,6 @@
     <w:lvlOverride w:ilvl="8">
       <w:startOverride w:val="1"/>
     </w:lvlOverride>
-  </w:num>
-  <w:num w:numId="1008">
-    <w:abstractNumId w:val="991"/>
   </w:num>
   <w:num w:numId="1009">
     <w:abstractNumId w:val="99411"/>
@@ -2107,39 +2076,6 @@
     <w:abstractNumId w:val="991"/>
   </w:num>
   <w:num w:numId="1011">
-    <w:abstractNumId w:val="99411"/>
-    <w:lvlOverride w:ilvl="0">
-      <w:startOverride w:val="1"/>
-    </w:lvlOverride>
-    <w:lvlOverride w:ilvl="1">
-      <w:startOverride w:val="1"/>
-    </w:lvlOverride>
-    <w:lvlOverride w:ilvl="2">
-      <w:startOverride w:val="1"/>
-    </w:lvlOverride>
-    <w:lvlOverride w:ilvl="3">
-      <w:startOverride w:val="1"/>
-    </w:lvlOverride>
-    <w:lvlOverride w:ilvl="4">
-      <w:startOverride w:val="1"/>
-    </w:lvlOverride>
-    <w:lvlOverride w:ilvl="5">
-      <w:startOverride w:val="1"/>
-    </w:lvlOverride>
-    <w:lvlOverride w:ilvl="6">
-      <w:startOverride w:val="1"/>
-    </w:lvlOverride>
-    <w:lvlOverride w:ilvl="7">
-      <w:startOverride w:val="1"/>
-    </w:lvlOverride>
-    <w:lvlOverride w:ilvl="8">
-      <w:startOverride w:val="1"/>
-    </w:lvlOverride>
-  </w:num>
-  <w:num w:numId="1012">
-    <w:abstractNumId w:val="991"/>
-  </w:num>
-  <w:num w:numId="1013">
     <w:abstractNumId w:val="99411"/>
     <w:lvlOverride w:ilvl="0">
       <w:startOverride w:val="1"/>

</xml_diff>

<commit_message>
fix(assignment-02): make the confusion matrix question fully determinate
</commit_message>
<xml_diff>
--- a/assignments/02-assignment.docx
+++ b/assignments/02-assignment.docx
@@ -544,6 +544,43 @@
         <w:pStyle w:val="FirstParagraph"/>
       </w:pPr>
       <w:r>
+        <w:t xml:space="preserve">Every fraud the bank misses costs it</w:t>
+      </w:r>
+      <w:r>
+        <w:t xml:space="preserve"> </w:t>
+      </w:r>
+      <w:r>
+        <w:rPr>
+          <w:b/>
+          <w:bCs/>
+        </w:rPr>
+        <w:t xml:space="preserve">$200</w:t>
+      </w:r>
+      <w:r>
+        <w:t xml:space="preserve">. Every legitimate transaction it wrongly flags costs it</w:t>
+      </w:r>
+      <w:r>
+        <w:t xml:space="preserve"> </w:t>
+      </w:r>
+      <w:r>
+        <w:rPr>
+          <w:b/>
+          <w:bCs/>
+        </w:rPr>
+        <w:t xml:space="preserve">$5</w:t>
+      </w:r>
+      <w:r>
+        <w:t xml:space="preserve"> </w:t>
+      </w:r>
+      <w:r>
+        <w:t xml:space="preserve">in support calls.</w:t>
+      </w:r>
+    </w:p>
+    <w:p>
+      <w:pPr>
+        <w:pStyle w:val="BodyText"/>
+      </w:pPr>
+      <w:r>
         <w:rPr>
           <w:b/>
           <w:bCs/>
@@ -617,7 +654,7 @@
         </w:numPr>
       </w:pPr>
       <w:r>
-        <w:t xml:space="preserve">The vendor advertises the system using its accuracy. Explain what that number hides</w:t>
+        <w:t xml:space="preserve">A second system flags nothing at all, so it catches no fraud. Calculate its accuracy on the same 10,000 transactions</w:t>
       </w:r>
     </w:p>
     <w:p>
@@ -629,7 +666,19 @@
         </w:numPr>
       </w:pPr>
       <w:r>
-        <w:t xml:space="preserve">Which of the two errors costs the bank more, and which metric would you prioritise? Say what you would give up in exchange</w:t>
+        <w:t xml:space="preserve">Calculate what the errors cost the bank under each system: the one tested, and the one that flags nothing</w:t>
+      </w:r>
+    </w:p>
+    <w:p>
+      <w:pPr>
+        <w:pStyle w:val="Compact"/>
+        <w:numPr>
+          <w:ilvl w:val="0"/>
+          <w:numId w:val="1005"/>
+        </w:numPr>
+      </w:pPr>
+      <w:r>
+        <w:t xml:space="preserve">Which measure should the bank use to decide whether to deploy the tested system, accuracy or total cost? Justify your answer with your own numbers</w:t>
       </w:r>
     </w:p>
     <w:p>

</xml_diff>

<commit_message>
fix(assignment-02): drop the fruit prompt bullet from the temperature question
</commit_message>
<xml_diff>
--- a/assignments/02-assignment.docx
+++ b/assignments/02-assignment.docx
@@ -974,34 +974,6 @@
       </w:pPr>
       <w:r>
         <w:t xml:space="preserve">At temperature 2, is the writing still coherent? Quote your worst result</w:t>
-      </w:r>
-    </w:p>
-    <w:p>
-      <w:pPr>
-        <w:pStyle w:val="Compact"/>
-        <w:numPr>
-          <w:ilvl w:val="0"/>
-          <w:numId w:val="1007"/>
-        </w:numPr>
-      </w:pPr>
-      <w:r>
-        <w:t xml:space="preserve">Now try</w:t>
-      </w:r>
-      <w:r>
-        <w:t xml:space="preserve"> </w:t>
-      </w:r>
-      <w:r>
-        <w:rPr>
-          <w:i/>
-          <w:iCs/>
-        </w:rPr>
-        <w:t xml:space="preserve">“Name a fruit. Answer with one word.”</w:t>
-      </w:r>
-      <w:r>
-        <w:t xml:space="preserve"> </w:t>
-      </w:r>
-      <w:r>
-        <w:t xml:space="preserve">at both settings. It probably says apple every time. Explain why temperature cannot fix that</w:t>
       </w:r>
     </w:p>
     <w:p>

</xml_diff>

<commit_message>
feat(assignments): rewrite A05 and align A01-A04 with current lectures
- A05: new assignment on prompting and hallucination (lectures 10-11):
  PTCF cover letter for a real Bank of America internship, constraint
  game, meta-prompting with fixed task, style transfer with AI-ism
  count, model memory vs the course syllabus, failures essay, and a
  bonus on Frankfurt and Hicks et al. (2024)
- A01 Q2: name RLHF as the source of agreeable answers
- A02: 0.2% fraud base rate from lecture 05, contamination and
  overfitting hints no longer state the answer, quote fix, bonus context
- A03: AI Studio and tokeniser steps survive UI changes, Whisper stem,
  confidence-score test with an out-of-class object
- A04: Q2.2 and Q3.3 ask for the concept instead of stating it, Q3.2
  trade-off reworded, Lecture 05 pointer in Q2.1, Honor Council spelling
</commit_message>
<xml_diff>
--- a/assignments/02-assignment.docx
+++ b/assignments/02-assignment.docx
@@ -344,7 +344,7 @@
         </w:numPr>
       </w:pPr>
       <w:r>
-        <w:t xml:space="preserve">Exactly one of the five combines two paradigms. Identify it and name both</w:t>
+        <w:t xml:space="preserve">Does any of the five use more than one paradigm? If so, say which one and name the paradigms involved</w:t>
       </w:r>
     </w:p>
     <w:p>
@@ -424,7 +424,7 @@
         <w:pStyle w:val="FirstParagraph"/>
       </w:pPr>
       <w:r>
-        <w:t xml:space="preserve">A bank tests a fraud detection system on 10,000 transactions, of which 100 are fraudulent. The results:</w:t>
+        <w:t xml:space="preserve">A bank tests a fraud detection system on 10,000 transactions, of which 20 are fraudulent (the 0.2% figure from Lecture 05). The results:</w:t>
       </w:r>
     </w:p>
     <w:p>
@@ -446,7 +446,7 @@
           <w:b/>
           <w:bCs/>
         </w:rPr>
-        <w:t xml:space="preserve">20 fraudulent transactions</w:t>
+        <w:t xml:space="preserve">4 fraudulent transactions</w:t>
       </w:r>
       <w:r>
         <w:t xml:space="preserve"> </w:t>
@@ -474,7 +474,7 @@
           <w:b/>
           <w:bCs/>
         </w:rPr>
-        <w:t xml:space="preserve">80 fraudulent transactions</w:t>
+        <w:t xml:space="preserve">16 fraudulent transactions</w:t>
       </w:r>
       <w:r>
         <w:t xml:space="preserve"> </w:t>
@@ -502,7 +502,7 @@
           <w:b/>
           <w:bCs/>
         </w:rPr>
-        <w:t xml:space="preserve">9,880 legitimate transactions</w:t>
+        <w:t xml:space="preserve">9,960 legitimate transactions</w:t>
       </w:r>
       <w:r>
         <w:t xml:space="preserve"> </w:t>
@@ -806,7 +806,7 @@
         </w:numPr>
       </w:pPr>
       <w:r>
-        <w:t xml:space="preserve">Lecture 05 described two ways a model can score well without being any better: test data leaking into its training, and the model looking up answers during the test itself. Explain in your own words why each one makes a leaderboard score unreliable</w:t>
+        <w:t xml:space="preserve">Lecture 05 described two ways a model can score well on a benchmark without being any better at the underlying task. Name both, and explain in your own words why each one makes a leaderboard score unreliable</w:t>
       </w:r>
     </w:p>
     <w:p>
@@ -958,7 +958,7 @@
         </w:numPr>
       </w:pPr>
       <w:r>
-        <w:t xml:space="preserve">Rule A is perfect on the data it was built from. Name what has gone wrong, and explain why adding conditions made it worse</w:t>
+        <w:t xml:space="preserve">Rule A scores higher than Rule B on the 10 past customers, yet you probably did not choose it. Name the problem Lecture 05 gave this pattern, and explain why adding conditions made it worse</w:t>
       </w:r>
     </w:p>
     <w:p>
@@ -1179,7 +1179,7 @@
         <w:t xml:space="preserve"> </w:t>
       </w:r>
       <w:r>
-        <w:t xml:space="preserve">“may favour their own style”</w:t>
+        <w:t xml:space="preserve">“may favour its own style”</w:t>
       </w:r>
       <w:r>
         <w:t xml:space="preserve"> </w:t>
@@ -1253,7 +1253,7 @@
         <w:pStyle w:val="FirstParagraph"/>
       </w:pPr>
       <w:r>
-        <w:t xml:space="preserve">Lecture 04 covered RLHF: after pretraining, a model is tuned on human raters choosing between responses. Those raters were paid, worked to a rubric, and had deadlines. What the model learned is which answers those particular people preferred.</w:t>
+        <w:t xml:space="preserve">Lecture 04 covered RLHF: after pretraining, a model is tuned on human raters choosing between responses. The slides did not say who those raters were. In practice they were paid contractors, working to a rubric, under deadlines. What the model learned is which answers those particular people preferred.</w:t>
       </w:r>
     </w:p>
     <w:p>

</xml_diff>

<commit_message>
fix(assignment-02): align Q3 with lecture 05 benchmark slide, clarify Q4 and bonus wording
</commit_message>
<xml_diff>
--- a/assignments/02-assignment.docx
+++ b/assignments/02-assignment.docx
@@ -806,7 +806,7 @@
         </w:numPr>
       </w:pPr>
       <w:r>
-        <w:t xml:space="preserve">Lecture 05 described two ways a model can score well on a benchmark without being any better at the underlying task. Name both, and explain in your own words why each one makes a leaderboard score unreliable</w:t>
+        <w:t xml:space="preserve">Lecture 05 listed several ways a model can score well on a benchmark without being any better at the underlying task. Name two of them, and explain in your own words why each one makes a benchmark score unreliable</w:t>
       </w:r>
     </w:p>
     <w:p>
@@ -946,7 +946,7 @@
         </w:numPr>
       </w:pPr>
       <w:r>
-        <w:t xml:space="preserve">The shop is about to apply one rule to its next 1,000 customers. Which would you choose, and what accuracy would you expect from each?</w:t>
+        <w:t xml:space="preserve">The shop is about to apply one rule to its next 1,000 customers. Which would you choose, and would you expect that rule to do better or worse on the new customers than on the 10 old ones? Explain why</w:t>
       </w:r>
     </w:p>
     <w:p>
@@ -1253,7 +1253,7 @@
         <w:pStyle w:val="FirstParagraph"/>
       </w:pPr>
       <w:r>
-        <w:t xml:space="preserve">Lecture 04 covered RLHF: after pretraining, a model is tuned on human raters choosing between responses. The slides did not say who those raters were. In practice they were paid contractors, working to a rubric, under deadlines. What the model learned is which answers those particular people preferred.</w:t>
+        <w:t xml:space="preserve">Lecture 04 covered RLHF: after the base model is trained on text, it is tuned on human raters choosing between responses. The slides did not say who those raters were. In practice they were paid contractors, working to a rubric, under deadlines. What the model learned is which answers those particular people preferred.</w:t>
       </w:r>
     </w:p>
     <w:p>
@@ -1277,7 +1277,7 @@
         </w:numPr>
       </w:pPr>
       <w:r>
-        <w:t xml:space="preserve">In assignment 01 you pushed a model into calling weak work A-grade. Explain how RLHF could have produced that behaviour</w:t>
+        <w:t xml:space="preserve">In assignment 01 you pressed a model to upgrade weak work to an A. Whether or not it gave in, explain how RLHF could produce that behaviour</w:t>
       </w:r>
     </w:p>
     <w:p>

</xml_diff>